<commit_message>
Add leaf favicon and EIN 700-word press release edition.
Use the two-leaf logo for icon.svg and apple-icon; add trimmed EIN submit assets and --submit docx generator flag.

Co-authored-by: Cursor <cursoragent@cursor.com>
</commit_message>
<xml_diff>
--- a/marketing/press-releases/ein-miami-dade-aging-roofs-hurricane-season-2026.docx
+++ b/marketing/press-releases/ein-miami-dade-aging-roofs-hurricane-season-2026.docx
@@ -39,7 +39,7 @@
     </w:p>
     <w:p>
       <w:r>
-        <w:t>DataBloomer's 2026 Miami-Dade Aging Roof Index analyzes 2,593 homes in a well-aged cohort (roofs strictly over 15 years old). In that cohort, 93 homes currently score 80+ on DataBloom Score, DataBloomer's signal for near-term replacement likelihood. Average roof age in the analyzed set is 16.8 years. The analysis is produced from Miami-Dade building permit history and property appraiser records, then modeled at ZIP level so contractors and residents can compare neighborhoods without publishing individual property identifiers in the public edition.</w:t>
+        <w:t>DataBloomer's 2026 Miami-Dade Aging Roof Index analyzes 49,953 homes in a well-aged cohort (roofs strictly over 15 years old). In that cohort, 20,729 homes currently score 80+ on DataBloom Score, DataBloomer's signal for near-term replacement likelihood. Average roof age in the analyzed set is 21.4 years. The analysis is produced from Miami-Dade building permit history and property appraiser records, then modeled at ZIP level so contractors and residents can compare neighborhoods without publishing individual property identifiers in the public edition.</w:t>
       </w:r>
     </w:p>
     <w:p>
@@ -60,7 +60,7 @@
         <w:pStyle w:val="ListNumber"/>
       </w:pPr>
       <w:r>
-        <w:t>1. ZIP 33165 (Westchester) — bloom score 83, 93 replacement-likely homes, avg roof age 21.8 years</w:t>
+        <w:t>1. ZIP 33034 (Florida City) — bloom score 93, 96 replacement-likely homes, avg roof age 20.5 years</w:t>
       </w:r>
     </w:p>
     <w:p>
@@ -68,7 +68,7 @@
         <w:pStyle w:val="ListNumber"/>
       </w:pPr>
       <w:r>
-        <w:t>2. ZIP 33142 (Miami-Dade 33142) — bloom score 76, 0 replacement-likely homes, avg roof age 16.8 years</w:t>
+        <w:t>2. ZIP 33156 (Pinecrest) — bloom score 90, 328 replacement-likely homes, avg roof age 20.8 years</w:t>
       </w:r>
     </w:p>
     <w:p>
@@ -76,7 +76,7 @@
         <w:pStyle w:val="ListNumber"/>
       </w:pPr>
       <w:r>
-        <w:t>3. ZIP 33032 (Miami-Dade 33032) — bloom score 76, 0 replacement-likely homes, avg roof age 16.2 years</w:t>
+        <w:t>3. ZIP 33194 (Miami-Dade 33194) — bloom score 89, 810 replacement-likely homes, avg roof age 22.1 years</w:t>
       </w:r>
     </w:p>
     <w:p>

</xml_diff>